<commit_message>
Word: xuong dong, #each, #if/#ifnot, rowif (nhom dong), anh PNG/JPEG, so thanh chu; demo PO 2 lien + chu ky; bo test Python
Co-Authored-By: Claude Opus 5.5 <noreply@anthropic.com>
</commit_message>
<xml_diff>
--- a/export-word/template/demo_template.docx
+++ b/export-word/template/demo_template.docx
@@ -2,6 +2,22 @@
 <file path=word/document.xml><?xml version="1.0" encoding="utf-8"?>
 <w:document xmlns:wpc="http://schemas.microsoft.com/office/word/2010/wordprocessingCanvas" xmlns:mo="http://schemas.microsoft.com/office/mac/office/2008/main" xmlns:mc="http://schemas.openxmlformats.org/markup-compatibility/2006" xmlns:mv="urn:schemas-microsoft-com:mac:vml" xmlns:o="urn:schemas-microsoft-com:office:office" xmlns:r="http://schemas.openxmlformats.org/officeDocument/2006/relationships" xmlns:m="http://schemas.openxmlformats.org/officeDocument/2006/math" xmlns:v="urn:schemas-microsoft-com:vml" xmlns:wp14="http://schemas.microsoft.com/office/word/2010/wordprocessingDrawing" xmlns:wp="http://schemas.openxmlformats.org/drawingml/2006/wordprocessingDrawing" xmlns:w10="urn:schemas-microsoft-com:office:word" xmlns:w="http://schemas.openxmlformats.org/wordprocessingml/2006/main" xmlns:w14="http://schemas.microsoft.com/office/word/2010/wordml" xmlns:wpg="http://schemas.microsoft.com/office/word/2010/wordprocessingGroup" xmlns:wpi="http://schemas.microsoft.com/office/word/2010/wordprocessingInk" xmlns:wne="http://schemas.microsoft.com/office/word/2006/wordml" xmlns:wps="http://schemas.microsoft.com/office/word/2010/wordprocessingShape" mc:Ignorable="w14 wp14">
   <w:body>
+    <w:p>
+      <w:r>
+        <w:t>${#each:copies}</w:t>
+      </w:r>
+    </w:p>
+    <w:p>
+      <w:pPr>
+        <w:jc w:val="right"/>
+      </w:pPr>
+      <w:r>
+        <w:rPr>
+          <w:i/>
+        </w:rPr>
+        <w:t>${label}</w:t>
+      </w:r>
+    </w:p>
     <w:p>
       <w:pPr>
         <w:jc w:val="center"/>
@@ -183,11 +199,28 @@
       <w:tr>
         <w:tc>
           <w:tcPr>
+            <w:tcW w:type="dxa" w:w="8638"/>
+            <w:gridSpan w:val="7"/>
+          </w:tcPr>
+          <w:p>
+            <w:r/>
+            <w:r>
+              <w:rPr>
+                <w:b/>
+              </w:rPr>
+              <w:t>${rowif:isGroup}${table:items.groupLabel}</w:t>
+            </w:r>
+          </w:p>
+        </w:tc>
+      </w:tr>
+      <w:tr>
+        <w:tc>
+          <w:tcPr>
             <w:tcW w:type="dxa" w:w="1234"/>
           </w:tcPr>
           <w:p>
             <w:r>
-              <w:t>${table:items.item}</w:t>
+              <w:t>${rowif:isItem}${table:items.item}</w:t>
             </w:r>
           </w:p>
         </w:tc>
@@ -262,6 +295,33 @@
             <w:r/>
             <w:r>
               <w:rPr>
+                <w:i/>
+              </w:rPr>
+              <w:t>${rowif:isSubtotal}${table:items.groupLabel}</w:t>
+            </w:r>
+          </w:p>
+        </w:tc>
+        <w:tc>
+          <w:tcPr>
+            <w:tcW w:type="dxa" w:w="1234"/>
+          </w:tcPr>
+          <w:p>
+            <w:r>
+              <w:t>${table:items.amount}</w:t>
+            </w:r>
+          </w:p>
+        </w:tc>
+      </w:tr>
+      <w:tr>
+        <w:tc>
+          <w:tcPr>
+            <w:tcW w:type="dxa" w:w="7404"/>
+            <w:gridSpan w:val="6"/>
+          </w:tcPr>
+          <w:p>
+            <w:r/>
+            <w:r>
+              <w:rPr>
                 <w:b/>
               </w:rPr>
               <w:t>TỔNG CỘNG</w:t>
@@ -280,7 +340,57 @@
         </w:tc>
       </w:tr>
     </w:tbl>
-    <w:p/>
+    <w:p>
+      <w:r>
+        <w:rPr>
+          <w:b/>
+        </w:rPr>
+        <w:t xml:space="preserve">Bằng chữ: </w:t>
+      </w:r>
+      <w:r>
+        <w:t>${totalWords}</w:t>
+      </w:r>
+    </w:p>
+    <w:p>
+      <w:r>
+        <w:t>${#if:hasZeroPrice}</w:t>
+      </w:r>
+    </w:p>
+    <w:p>
+      <w:r>
+        <w:rPr>
+          <w:b/>
+          <w:color w:val="C00000"/>
+        </w:rPr>
+        <w:t>Lưu ý: đơn có dòng chưa có giá, cần bổ sung trước khi duyệt.</w:t>
+      </w:r>
+    </w:p>
+    <w:p>
+      <w:r>
+        <w:t>${/if:hasZeroPrice}</w:t>
+      </w:r>
+    </w:p>
+    <w:p>
+      <w:r>
+        <w:t>${#if:note}</w:t>
+      </w:r>
+    </w:p>
+    <w:p>
+      <w:r>
+        <w:rPr>
+          <w:b/>
+        </w:rPr>
+        <w:t xml:space="preserve">Ghi chú: </w:t>
+      </w:r>
+      <w:r>
+        <w:t>${note}</w:t>
+      </w:r>
+    </w:p>
+    <w:p>
+      <w:r>
+        <w:t>${/if:note}</w:t>
+      </w:r>
+    </w:p>
     <w:tbl>
       <w:tblPr>
         <w:tblW w:type="auto" w:w="0"/>
@@ -326,7 +436,69 @@
           </w:p>
         </w:tc>
       </w:tr>
+      <w:tr>
+        <w:tc>
+          <w:tcPr>
+            <w:tcW w:type="dxa" w:w="4320"/>
+          </w:tcPr>
+          <w:p>
+            <w:pPr>
+              <w:jc w:val="center"/>
+            </w:pPr>
+            <w:r>
+              <w:t>${image:sign|3}</w:t>
+            </w:r>
+          </w:p>
+        </w:tc>
+        <w:tc>
+          <w:tcPr>
+            <w:tcW w:type="dxa" w:w="4320"/>
+          </w:tcPr>
+          <w:p/>
+        </w:tc>
+      </w:tr>
+      <w:tr>
+        <w:tc>
+          <w:tcPr>
+            <w:tcW w:type="dxa" w:w="4320"/>
+          </w:tcPr>
+          <w:p>
+            <w:pPr>
+              <w:jc w:val="center"/>
+            </w:pPr>
+            <w:r>
+              <w:t>${printedBy}</w:t>
+            </w:r>
+          </w:p>
+        </w:tc>
+        <w:tc>
+          <w:tcPr>
+            <w:tcW w:type="dxa" w:w="4320"/>
+          </w:tcPr>
+          <w:p/>
+        </w:tc>
+      </w:tr>
     </w:tbl>
+    <w:p>
+      <w:r>
+        <w:t>${#ifnot:isLast}</w:t>
+      </w:r>
+    </w:p>
+    <w:p>
+      <w:r>
+        <w:br w:type="page"/>
+      </w:r>
+    </w:p>
+    <w:p>
+      <w:r>
+        <w:t>${/if:isLast}</w:t>
+      </w:r>
+    </w:p>
+    <w:p>
+      <w:r>
+        <w:t>${/each:copies}</w:t>
+      </w:r>
+    </w:p>
     <w:sectPr>
       <w:headerReference w:type="default" r:id="rId9"/>
       <w:footerReference w:type="default" r:id="rId10"/>

</xml_diff>